<commit_message>
Allow integer communication levels
</commit_message>
<xml_diff>
--- a/docs/communication_incentives_proposal.docx
+++ b/docs/communication_incentives_proposal.docx
@@ -321,6 +321,11 @@
     <w:p>
       <w:r>
         <w:t>In each round, after receiving the score for its previous submission, every agent first decides whether to make its information visible to others. An agent may keep its information private, reveal it to one selected agent, reveal it to a small group, or reveal it to all other agents. The shared information may include the point the agent submitted, the score it received, and a short explanation of its current search strategy.</w:t>
+      </w:r>
+    </w:p>
+    <w:p>
+      <w:r>
+        <w:t>The visibility and request amounts are represented as nonnegative integers, or as all. For example, a value of 2 means two peers. Values larger than the number of available peers are capped at all available peers.</w:t>
       </w:r>
     </w:p>
     <w:p>

</xml_diff>